<commit_message>
Add Code and Data Availability section and update paper
- Add Code_Data_Availability.docx with repository reference, script descriptions, and reproducibility statement
- Add build_availability.js (docx-js builder for the availability section)
- Update Paper_8_Klein_Quartic.docx with latest content

Co-Authored-By: Claude Opus 4.6 <noreply@anthropic.com>
</commit_message>
<xml_diff>
--- a/Paper_8_Klein_Quartic - Copy.docx
+++ b/Paper_8_Klein_Quartic - Copy.docx
@@ -2033,12 +2033,6 @@
         <w:gridCol w:w="2760"/>
       </w:tblGrid>
       <w:tr>
-        <w:tblPrEx>
-          <w:tblCellMar>
-            <w:top w:w="0" w:type="dxa"/>
-            <w:bottom w:w="0" w:type="dxa"/>
-          </w:tblCellMar>
-        </w:tblPrEx>
         <w:tc>
           <w:tcPr>
             <w:tcW w:w="2400" w:type="dxa"/>
@@ -2191,12 +2185,6 @@
         </w:tc>
       </w:tr>
       <w:tr>
-        <w:tblPrEx>
-          <w:tblCellMar>
-            <w:top w:w="0" w:type="dxa"/>
-            <w:bottom w:w="0" w:type="dxa"/>
-          </w:tblCellMar>
-        </w:tblPrEx>
         <w:tc>
           <w:tcPr>
             <w:tcW w:w="2400" w:type="dxa"/>
@@ -2345,12 +2333,6 @@
         </w:tc>
       </w:tr>
       <w:tr>
-        <w:tblPrEx>
-          <w:tblCellMar>
-            <w:top w:w="0" w:type="dxa"/>
-            <w:bottom w:w="0" w:type="dxa"/>
-          </w:tblCellMar>
-        </w:tblPrEx>
         <w:tc>
           <w:tcPr>
             <w:tcW w:w="2400" w:type="dxa"/>
@@ -2515,12 +2497,6 @@
         </w:tc>
       </w:tr>
       <w:tr>
-        <w:tblPrEx>
-          <w:tblCellMar>
-            <w:top w:w="0" w:type="dxa"/>
-            <w:bottom w:w="0" w:type="dxa"/>
-          </w:tblCellMar>
-        </w:tblPrEx>
         <w:tc>
           <w:tcPr>
             <w:tcW w:w="2400" w:type="dxa"/>
@@ -2709,12 +2685,6 @@
         </w:tc>
       </w:tr>
       <w:tr>
-        <w:tblPrEx>
-          <w:tblCellMar>
-            <w:top w:w="0" w:type="dxa"/>
-            <w:bottom w:w="0" w:type="dxa"/>
-          </w:tblCellMar>
-        </w:tblPrEx>
         <w:tc>
           <w:tcPr>
             <w:tcW w:w="2400" w:type="dxa"/>
@@ -2873,12 +2843,6 @@
         </w:tc>
       </w:tr>
       <w:tr>
-        <w:tblPrEx>
-          <w:tblCellMar>
-            <w:top w:w="0" w:type="dxa"/>
-            <w:bottom w:w="0" w:type="dxa"/>
-          </w:tblCellMar>
-        </w:tblPrEx>
         <w:tc>
           <w:tcPr>
             <w:tcW w:w="2400" w:type="dxa"/>
@@ -3033,12 +2997,6 @@
         </w:tc>
       </w:tr>
       <w:tr>
-        <w:tblPrEx>
-          <w:tblCellMar>
-            <w:top w:w="0" w:type="dxa"/>
-            <w:bottom w:w="0" w:type="dxa"/>
-          </w:tblCellMar>
-        </w:tblPrEx>
         <w:tc>
           <w:tcPr>
             <w:tcW w:w="2400" w:type="dxa"/>
@@ -3185,12 +3143,6 @@
         </w:tc>
       </w:tr>
       <w:tr>
-        <w:tblPrEx>
-          <w:tblCellMar>
-            <w:top w:w="0" w:type="dxa"/>
-            <w:bottom w:w="0" w:type="dxa"/>
-          </w:tblCellMar>
-        </w:tblPrEx>
         <w:tc>
           <w:tcPr>
             <w:tcW w:w="2400" w:type="dxa"/>
@@ -4849,15 +4801,7 @@
           <w:sz w:val="22"/>
           <w:szCs w:val="22"/>
         </w:rPr>
-        <w:t>𝔽</w:t>
-      </w:r>
-      <w:r>
-        <w:rPr>
-          <w:rFonts w:ascii="Cambria Math" w:hAnsi="Cambria Math" w:cs="Cambria Math"/>
-          <w:sz w:val="22"/>
-          <w:szCs w:val="22"/>
-        </w:rPr>
-        <w:t>₇</w:t>
+        <w:t>𝔽₇</w:t>
       </w:r>
       <w:r>
         <w:rPr>
@@ -4873,15 +4817,7 @@
           <w:sz w:val="22"/>
           <w:szCs w:val="22"/>
         </w:rPr>
-        <w:t>𝔽</w:t>
-      </w:r>
-      <w:r>
-        <w:rPr>
-          <w:rFonts w:ascii="Cambria Math" w:hAnsi="Cambria Math" w:cs="Cambria Math"/>
-          <w:sz w:val="22"/>
-          <w:szCs w:val="22"/>
-        </w:rPr>
-        <w:t>₇</w:t>
+        <w:t>𝔽₇</w:t>
       </w:r>
       <w:r>
         <w:rPr>
@@ -4905,6 +4841,7 @@
       <w:r>
         <w:rPr>
           <w:rFonts w:ascii="Arial" w:hAnsi="Arial" w:cs="Arial"/>
+          <w:noProof/>
           <w:sz w:val="22"/>
           <w:szCs w:val="22"/>
         </w:rPr>
@@ -5451,15 +5388,7 @@
           <w:sz w:val="22"/>
           <w:szCs w:val="22"/>
         </w:rPr>
-        <w:t>𝔽</w:t>
-      </w:r>
-      <w:r>
-        <w:rPr>
-          <w:rFonts w:ascii="Cambria Math" w:hAnsi="Cambria Math" w:cs="Cambria Math"/>
-          <w:sz w:val="22"/>
-          <w:szCs w:val="22"/>
-        </w:rPr>
-        <w:t>₂</w:t>
+        <w:t>𝔽₂</w:t>
       </w:r>
       <w:r>
         <w:rPr>
@@ -5617,15 +5546,7 @@
           <w:sz w:val="22"/>
           <w:szCs w:val="22"/>
         </w:rPr>
-        <w:t>𝔽</w:t>
-      </w:r>
-      <w:r>
-        <w:rPr>
-          <w:rFonts w:ascii="Cambria Math" w:hAnsi="Cambria Math" w:cs="Cambria Math"/>
-          <w:sz w:val="22"/>
-          <w:szCs w:val="22"/>
-        </w:rPr>
-        <w:t>₂</w:t>
+        <w:t>𝔽₂</w:t>
       </w:r>
       <w:r>
         <w:rPr>
@@ -5853,6 +5774,156 @@
       <w:r>
         <w:rPr>
           <w:rFonts w:ascii="Arial" w:hAnsi="Arial" w:cs="Arial"/>
+          <w:b/>
+          <w:bCs/>
+          <w:i/>
+          <w:iCs/>
+          <w:sz w:val="22"/>
+          <w:szCs w:val="22"/>
+        </w:rPr>
+        <w:br/>
+      </w:r>
+      <w:r>
+        <w:rPr>
+          <w:rFonts w:ascii="Arial" w:hAnsi="Arial" w:cs="Arial"/>
+          <w:b/>
+          <w:bCs/>
+          <w:i/>
+          <w:iCs/>
+          <w:sz w:val="22"/>
+          <w:szCs w:val="22"/>
+        </w:rPr>
+        <w:t>Theorem (Theta Characteristic Split).</w:t>
+      </w:r>
+      <w:r>
+        <w:rPr>
+          <w:rFonts w:ascii="Arial" w:hAnsi="Arial" w:cs="Arial"/>
+          <w:sz w:val="22"/>
+          <w:szCs w:val="22"/>
+        </w:rPr>
+        <w:t xml:space="preserve"> For a smooth genus-3 curve, the 64 theta characteristics split as 36 even and 28 odd. The 36 even characteristics equal the number of positive roots of E</w:t>
+      </w:r>
+      <w:r>
+        <w:rPr>
+          <w:rFonts w:ascii="Cambria Math" w:hAnsi="Cambria Math" w:cs="Cambria Math"/>
+          <w:sz w:val="22"/>
+          <w:szCs w:val="22"/>
+        </w:rPr>
+        <w:t>₆</w:t>
+      </w:r>
+      <w:r>
+        <w:rPr>
+          <w:rFonts w:ascii="Arial" w:hAnsi="Arial" w:cs="Arial"/>
+          <w:sz w:val="22"/>
+          <w:szCs w:val="22"/>
+        </w:rPr>
+        <w:t>, and the 28 odd characteristics equal dim(D</w:t>
+      </w:r>
+      <w:r>
+        <w:rPr>
+          <w:rFonts w:ascii="Cambria Math" w:hAnsi="Cambria Math" w:cs="Cambria Math"/>
+          <w:sz w:val="22"/>
+          <w:szCs w:val="22"/>
+        </w:rPr>
+        <w:t>₄</w:t>
+      </w:r>
+      <w:r>
+        <w:rPr>
+          <w:rFonts w:ascii="Arial" w:hAnsi="Arial" w:cs="Arial"/>
+          <w:sz w:val="22"/>
+          <w:szCs w:val="22"/>
+        </w:rPr>
+        <w:t>) = dim(</w:t>
+      </w:r>
+      <w:proofErr w:type="gramStart"/>
+      <w:r>
+        <w:rPr>
+          <w:rFonts w:ascii="Arial" w:hAnsi="Arial" w:cs="Arial"/>
+          <w:sz w:val="22"/>
+          <w:szCs w:val="22"/>
+        </w:rPr>
+        <w:t>so(</w:t>
+      </w:r>
+      <w:proofErr w:type="gramEnd"/>
+      <w:r>
+        <w:rPr>
+          <w:rFonts w:ascii="Arial" w:hAnsi="Arial" w:cs="Arial"/>
+          <w:sz w:val="22"/>
+          <w:szCs w:val="22"/>
+        </w:rPr>
+        <w:t xml:space="preserve">8)). </w:t>
+      </w:r>
+      <w:proofErr w:type="gramStart"/>
+      <w:r>
+        <w:rPr>
+          <w:rFonts w:ascii="Arial" w:hAnsi="Arial" w:cs="Arial"/>
+          <w:sz w:val="22"/>
+          <w:szCs w:val="22"/>
+        </w:rPr>
+        <w:t>PSL(</w:t>
+      </w:r>
+      <w:proofErr w:type="gramEnd"/>
+      <w:r>
+        <w:rPr>
+          <w:rFonts w:ascii="Arial" w:hAnsi="Arial" w:cs="Arial"/>
+          <w:sz w:val="22"/>
+          <w:szCs w:val="22"/>
+        </w:rPr>
+        <w:t xml:space="preserve">2,7) acts transitively on the 28 odd characteristics with </w:t>
+      </w:r>
+      <w:proofErr w:type="spellStart"/>
+      <w:r>
+        <w:rPr>
+          <w:rFonts w:ascii="Arial" w:hAnsi="Arial" w:cs="Arial"/>
+          <w:sz w:val="22"/>
+          <w:szCs w:val="22"/>
+        </w:rPr>
+        <w:t>stabiliser</w:t>
+      </w:r>
+      <w:proofErr w:type="spellEnd"/>
+      <w:r>
+        <w:rPr>
+          <w:rFonts w:ascii="Arial" w:hAnsi="Arial" w:cs="Arial"/>
+          <w:sz w:val="22"/>
+          <w:szCs w:val="22"/>
+        </w:rPr>
+        <w:t xml:space="preserve"> S</w:t>
+      </w:r>
+      <w:r>
+        <w:rPr>
+          <w:rFonts w:ascii="Cambria Math" w:hAnsi="Cambria Math" w:cs="Cambria Math"/>
+          <w:sz w:val="22"/>
+          <w:szCs w:val="22"/>
+        </w:rPr>
+        <w:t>₃</w:t>
+      </w:r>
+      <w:r>
+        <w:rPr>
+          <w:rFonts w:ascii="Arial" w:hAnsi="Arial" w:cs="Arial"/>
+          <w:sz w:val="22"/>
+          <w:szCs w:val="22"/>
+        </w:rPr>
+        <w:t xml:space="preserve"> of order 6. [Computation AZ-1]</w:t>
+      </w:r>
+      <w:r>
+        <w:rPr>
+          <w:rFonts w:ascii="Arial" w:hAnsi="Arial" w:cs="Arial"/>
+          <w:sz w:val="22"/>
+          <w:szCs w:val="22"/>
+        </w:rPr>
+        <w:br/>
+      </w:r>
+      <w:r>
+        <w:rPr>
+          <w:rFonts w:ascii="Arial" w:hAnsi="Arial" w:cs="Arial"/>
+          <w:sz w:val="22"/>
+          <w:szCs w:val="22"/>
+        </w:rPr>
+        <w:br/>
+      </w:r>
+      <w:r>
+        <w:rPr>
+          <w:rFonts w:ascii="Arial" w:hAnsi="Arial" w:cs="Arial"/>
           <w:sz w:val="22"/>
           <w:szCs w:val="22"/>
         </w:rPr>
@@ -6038,15 +6109,7 @@
           <w:sz w:val="22"/>
           <w:szCs w:val="22"/>
         </w:rPr>
-        <w:t>𝔽</w:t>
-      </w:r>
-      <w:r>
-        <w:rPr>
-          <w:rFonts w:ascii="Cambria Math" w:hAnsi="Cambria Math" w:cs="Cambria Math"/>
-          <w:sz w:val="22"/>
-          <w:szCs w:val="22"/>
-        </w:rPr>
-        <w:t>₂</w:t>
+        <w:t>𝔽₂</w:t>
       </w:r>
       <w:r>
         <w:rPr>
@@ -6062,15 +6125,7 @@
           <w:sz w:val="22"/>
           <w:szCs w:val="22"/>
         </w:rPr>
-        <w:t>𝔽</w:t>
-      </w:r>
-      <w:r>
-        <w:rPr>
-          <w:rFonts w:ascii="Cambria Math" w:hAnsi="Cambria Math" w:cs="Cambria Math"/>
-          <w:sz w:val="22"/>
-          <w:szCs w:val="22"/>
-        </w:rPr>
-        <w:t>₂</w:t>
+        <w:t>𝔽₂</w:t>
       </w:r>
       <w:r>
         <w:rPr>
@@ -6086,15 +6141,7 @@
           <w:sz w:val="22"/>
           <w:szCs w:val="22"/>
         </w:rPr>
-        <w:t>𝔽</w:t>
-      </w:r>
-      <w:r>
-        <w:rPr>
-          <w:rFonts w:ascii="Cambria Math" w:hAnsi="Cambria Math" w:cs="Cambria Math"/>
-          <w:sz w:val="22"/>
-          <w:szCs w:val="22"/>
-        </w:rPr>
-        <w:t>₂</w:t>
+        <w:t>𝔽₂</w:t>
       </w:r>
       <w:r>
         <w:rPr>
@@ -6126,15 +6173,7 @@
           <w:sz w:val="22"/>
           <w:szCs w:val="22"/>
         </w:rPr>
-        <w:t>𝔽</w:t>
-      </w:r>
-      <w:r>
-        <w:rPr>
-          <w:rFonts w:ascii="Cambria Math" w:hAnsi="Cambria Math" w:cs="Cambria Math"/>
-          <w:sz w:val="22"/>
-          <w:szCs w:val="22"/>
-        </w:rPr>
-        <w:t>₂</w:t>
+        <w:t>𝔽₂</w:t>
       </w:r>
       <w:proofErr w:type="gramStart"/>
       <w:r>
@@ -9332,6 +9371,220 @@
         </w:rPr>
         <w:t xml:space="preserve"> is the Galois automorphism of the CM totally real subfield.</w:t>
       </w:r>
+      <w:r>
+        <w:rPr>
+          <w:rFonts w:ascii="Arial" w:hAnsi="Arial" w:cs="Arial"/>
+          <w:sz w:val="22"/>
+          <w:szCs w:val="22"/>
+        </w:rPr>
+        <w:t xml:space="preserve"> </w:t>
+      </w:r>
+    </w:p>
+    <w:p>
+      <w:pPr>
+        <w:spacing w:after="200"/>
+        <w:rPr>
+          <w:rFonts w:ascii="Arial" w:hAnsi="Arial" w:cs="Arial"/>
+          <w:sz w:val="22"/>
+          <w:szCs w:val="22"/>
+        </w:rPr>
+      </w:pPr>
+      <w:r>
+        <w:rPr>
+          <w:rFonts w:ascii="Arial" w:hAnsi="Arial" w:cs="Arial"/>
+          <w:b/>
+          <w:bCs/>
+          <w:i/>
+          <w:iCs/>
+          <w:sz w:val="22"/>
+          <w:szCs w:val="22"/>
+        </w:rPr>
+        <w:t>Theorem (S</w:t>
+      </w:r>
+      <w:r>
+        <w:rPr>
+          <w:rFonts w:ascii="Cambria Math" w:hAnsi="Cambria Math" w:cs="Cambria Math"/>
+          <w:b/>
+          <w:bCs/>
+          <w:i/>
+          <w:iCs/>
+          <w:sz w:val="22"/>
+          <w:szCs w:val="22"/>
+        </w:rPr>
+        <w:t>₃</w:t>
+      </w:r>
+      <w:r>
+        <w:rPr>
+          <w:rFonts w:ascii="Arial" w:hAnsi="Arial" w:cs="Arial"/>
+          <w:b/>
+          <w:bCs/>
+          <w:i/>
+          <w:iCs/>
+          <w:sz w:val="22"/>
+          <w:szCs w:val="22"/>
+        </w:rPr>
+        <w:t>/CM Identification).</w:t>
+      </w:r>
+      <w:r>
+        <w:rPr>
+          <w:rFonts w:ascii="Arial" w:hAnsi="Arial" w:cs="Arial"/>
+          <w:sz w:val="22"/>
+          <w:szCs w:val="22"/>
+        </w:rPr>
+        <w:t xml:space="preserve"> The Z/3Z subgroup of the bitangent </w:t>
+      </w:r>
+      <w:proofErr w:type="spellStart"/>
+      <w:r>
+        <w:rPr>
+          <w:rFonts w:ascii="Arial" w:hAnsi="Arial" w:cs="Arial"/>
+          <w:sz w:val="22"/>
+          <w:szCs w:val="22"/>
+        </w:rPr>
+        <w:t>stabiliser</w:t>
+      </w:r>
+      <w:proofErr w:type="spellEnd"/>
+      <w:r>
+        <w:rPr>
+          <w:rFonts w:ascii="Arial" w:hAnsi="Arial" w:cs="Arial"/>
+          <w:sz w:val="22"/>
+          <w:szCs w:val="22"/>
+        </w:rPr>
+        <w:t xml:space="preserve"> S</w:t>
+      </w:r>
+      <w:r>
+        <w:rPr>
+          <w:rFonts w:ascii="Cambria Math" w:hAnsi="Cambria Math" w:cs="Cambria Math"/>
+          <w:sz w:val="22"/>
+          <w:szCs w:val="22"/>
+        </w:rPr>
+        <w:t>₃</w:t>
+      </w:r>
+      <w:r>
+        <w:rPr>
+          <w:rFonts w:ascii="Arial" w:hAnsi="Arial" w:cs="Arial"/>
+          <w:sz w:val="22"/>
+          <w:szCs w:val="22"/>
+        </w:rPr>
+        <w:t xml:space="preserve"> </w:t>
+      </w:r>
+      <w:r>
+        <w:rPr>
+          <w:rFonts w:ascii="Cambria Math" w:hAnsi="Cambria Math" w:cs="Cambria Math"/>
+          <w:sz w:val="22"/>
+          <w:szCs w:val="22"/>
+        </w:rPr>
+        <w:t>⊂</w:t>
+      </w:r>
+      <w:r>
+        <w:rPr>
+          <w:rFonts w:ascii="Arial" w:hAnsi="Arial" w:cs="Arial"/>
+          <w:sz w:val="22"/>
+          <w:szCs w:val="22"/>
+        </w:rPr>
+        <w:t xml:space="preserve"> </w:t>
+      </w:r>
+      <w:proofErr w:type="gramStart"/>
+      <w:r>
+        <w:rPr>
+          <w:rFonts w:ascii="Arial" w:hAnsi="Arial" w:cs="Arial"/>
+          <w:sz w:val="22"/>
+          <w:szCs w:val="22"/>
+        </w:rPr>
+        <w:t>PSL(</w:t>
+      </w:r>
+      <w:proofErr w:type="gramEnd"/>
+      <w:r>
+        <w:rPr>
+          <w:rFonts w:ascii="Arial" w:hAnsi="Arial" w:cs="Arial"/>
+          <w:sz w:val="22"/>
+          <w:szCs w:val="22"/>
+        </w:rPr>
+        <w:t>2,7) is canonically isomorphic to Gal(</w:t>
+      </w:r>
+      <w:r>
+        <w:rPr>
+          <w:rFonts w:ascii="Cambria Math" w:hAnsi="Cambria Math" w:cs="Cambria Math"/>
+          <w:sz w:val="22"/>
+          <w:szCs w:val="22"/>
+        </w:rPr>
+        <w:t>ℚ</w:t>
+      </w:r>
+      <w:r>
+        <w:rPr>
+          <w:rFonts w:ascii="Arial" w:hAnsi="Arial" w:cs="Arial"/>
+          <w:sz w:val="22"/>
+          <w:szCs w:val="22"/>
+        </w:rPr>
+        <w:t>(ζ</w:t>
+      </w:r>
+      <w:proofErr w:type="gramStart"/>
+      <w:r>
+        <w:rPr>
+          <w:rFonts w:ascii="Cambria Math" w:hAnsi="Cambria Math" w:cs="Cambria Math"/>
+          <w:sz w:val="22"/>
+          <w:szCs w:val="22"/>
+        </w:rPr>
+        <w:t>₇</w:t>
+      </w:r>
+      <w:r>
+        <w:rPr>
+          <w:rFonts w:ascii="Arial" w:hAnsi="Arial" w:cs="Arial"/>
+          <w:sz w:val="22"/>
+          <w:szCs w:val="22"/>
+        </w:rPr>
+        <w:t>)</w:t>
+      </w:r>
+      <w:r>
+        <w:rPr>
+          <w:rFonts w:ascii="Cambria Math" w:hAnsi="Cambria Math" w:cs="Cambria Math"/>
+          <w:sz w:val="22"/>
+          <w:szCs w:val="22"/>
+        </w:rPr>
+        <w:t>⁺</w:t>
+      </w:r>
+      <w:proofErr w:type="gramEnd"/>
+      <w:r>
+        <w:rPr>
+          <w:rFonts w:ascii="Arial" w:hAnsi="Arial" w:cs="Arial"/>
+          <w:sz w:val="22"/>
+          <w:szCs w:val="22"/>
+        </w:rPr>
+        <w:t>/</w:t>
+      </w:r>
+      <w:r>
+        <w:rPr>
+          <w:rFonts w:ascii="Cambria Math" w:hAnsi="Cambria Math" w:cs="Cambria Math"/>
+          <w:sz w:val="22"/>
+          <w:szCs w:val="22"/>
+        </w:rPr>
+        <w:t>ℚ</w:t>
+      </w:r>
+      <w:r>
+        <w:rPr>
+          <w:rFonts w:ascii="Arial" w:hAnsi="Arial" w:cs="Arial"/>
+          <w:sz w:val="22"/>
+          <w:szCs w:val="22"/>
+        </w:rPr>
+        <w:t xml:space="preserve">), the Galois group of the Klein quartic's totally real CM subfield. Both act by cyclic permutation of exactly three objects — the </w:t>
+      </w:r>
+      <w:proofErr w:type="spellStart"/>
+      <w:r>
+        <w:rPr>
+          <w:rFonts w:ascii="Arial" w:hAnsi="Arial" w:cs="Arial"/>
+          <w:sz w:val="22"/>
+          <w:szCs w:val="22"/>
+        </w:rPr>
+        <w:t>merkabit's</w:t>
+      </w:r>
+      <w:proofErr w:type="spellEnd"/>
+      <w:r>
+        <w:rPr>
+          <w:rFonts w:ascii="Arial" w:hAnsi="Arial" w:cs="Arial"/>
+          <w:sz w:val="22"/>
+          <w:szCs w:val="22"/>
+        </w:rPr>
+        <w:t xml:space="preserve"> gates {R, S, T} and the conjugates of 2cos(2π/7) respectively — and both are the unique normal subgroup of order 3 in their ambient group.</w:t>
+      </w:r>
     </w:p>
     <w:p>
       <w:pPr>
@@ -9366,6 +9619,7 @@
           <w:sz w:val="22"/>
           <w:szCs w:val="22"/>
         </w:rPr>
+        <w:lastRenderedPageBreak/>
         <w:t xml:space="preserve">The Z/2Z quotient in the Galois group is complex conjugation on </w:t>
       </w:r>
       <w:r>
@@ -9558,7 +9812,6 @@
         <w:rPr>
           <w:rFonts w:ascii="Arial" w:hAnsi="Arial" w:cs="Arial"/>
         </w:rPr>
-        <w:lastRenderedPageBreak/>
         <w:t>7. The E</w:t>
       </w:r>
       <w:r>
@@ -9744,6 +9997,300 @@
           <w:szCs w:val="22"/>
         </w:rPr>
         <w:t xml:space="preserve"> equals the totient of the binary configuration count.</w:t>
+      </w:r>
+      <w:r>
+        <w:rPr>
+          <w:rFonts w:ascii="Arial" w:hAnsi="Arial" w:cs="Arial"/>
+          <w:sz w:val="22"/>
+          <w:szCs w:val="22"/>
+        </w:rPr>
+        <w:t xml:space="preserve"> </w:t>
+      </w:r>
+    </w:p>
+    <w:p>
+      <w:pPr>
+        <w:spacing w:after="200"/>
+        <w:rPr>
+          <w:rFonts w:ascii="Arial" w:hAnsi="Arial" w:cs="Arial"/>
+          <w:sz w:val="22"/>
+          <w:szCs w:val="22"/>
+        </w:rPr>
+      </w:pPr>
+      <w:r>
+        <w:rPr>
+          <w:rFonts w:ascii="Arial" w:hAnsi="Arial" w:cs="Arial"/>
+          <w:b/>
+          <w:bCs/>
+          <w:i/>
+          <w:iCs/>
+          <w:sz w:val="22"/>
+          <w:szCs w:val="22"/>
+        </w:rPr>
+        <w:t>Theorem (E</w:t>
+      </w:r>
+      <w:r>
+        <w:rPr>
+          <w:rFonts w:ascii="Cambria Math" w:hAnsi="Cambria Math" w:cs="Cambria Math"/>
+          <w:b/>
+          <w:bCs/>
+          <w:i/>
+          <w:iCs/>
+          <w:sz w:val="22"/>
+          <w:szCs w:val="22"/>
+        </w:rPr>
+        <w:t>₈</w:t>
+      </w:r>
+      <w:r>
+        <w:rPr>
+          <w:rFonts w:ascii="Arial" w:hAnsi="Arial" w:cs="Arial"/>
+          <w:b/>
+          <w:bCs/>
+          <w:i/>
+          <w:iCs/>
+          <w:sz w:val="22"/>
+          <w:szCs w:val="22"/>
+        </w:rPr>
+        <w:t xml:space="preserve"> Cyclotomic Connection).</w:t>
+      </w:r>
+      <w:r>
+        <w:rPr>
+          <w:rFonts w:ascii="Arial" w:hAnsi="Arial" w:cs="Arial"/>
+          <w:sz w:val="22"/>
+          <w:szCs w:val="22"/>
+        </w:rPr>
+        <w:t xml:space="preserve"> h(E</w:t>
+      </w:r>
+      <w:r>
+        <w:rPr>
+          <w:rFonts w:ascii="Cambria Math" w:hAnsi="Cambria Math" w:cs="Cambria Math"/>
+          <w:sz w:val="22"/>
+          <w:szCs w:val="22"/>
+        </w:rPr>
+        <w:t>₈</w:t>
+      </w:r>
+      <w:r>
+        <w:rPr>
+          <w:rFonts w:ascii="Arial" w:hAnsi="Arial" w:cs="Arial"/>
+          <w:sz w:val="22"/>
+          <w:szCs w:val="22"/>
+        </w:rPr>
+        <w:t xml:space="preserve">) = 30 = </w:t>
+      </w:r>
+      <w:proofErr w:type="gramStart"/>
+      <w:r>
+        <w:rPr>
+          <w:rFonts w:ascii="Arial" w:hAnsi="Arial" w:cs="Arial"/>
+          <w:sz w:val="22"/>
+          <w:szCs w:val="22"/>
+        </w:rPr>
+        <w:t>φ(</w:t>
+      </w:r>
+      <w:proofErr w:type="gramEnd"/>
+      <w:r>
+        <w:rPr>
+          <w:rFonts w:ascii="Arial" w:hAnsi="Arial" w:cs="Arial"/>
+          <w:sz w:val="22"/>
+          <w:szCs w:val="22"/>
+        </w:rPr>
+        <w:t xml:space="preserve">31), where 31 counts the binary-accessible configurations of the dual pentachoron. The fields </w:t>
+      </w:r>
+      <w:r>
+        <w:rPr>
+          <w:rFonts w:ascii="Cambria Math" w:hAnsi="Cambria Math" w:cs="Cambria Math"/>
+          <w:sz w:val="22"/>
+          <w:szCs w:val="22"/>
+        </w:rPr>
+        <w:t>ℚ</w:t>
+      </w:r>
+      <w:r>
+        <w:rPr>
+          <w:rFonts w:ascii="Arial" w:hAnsi="Arial" w:cs="Arial"/>
+          <w:sz w:val="22"/>
+          <w:szCs w:val="22"/>
+        </w:rPr>
+        <w:t>(ζ</w:t>
+      </w:r>
+      <w:r>
+        <w:rPr>
+          <w:rFonts w:ascii="Cambria Math" w:hAnsi="Cambria Math" w:cs="Cambria Math"/>
+          <w:sz w:val="22"/>
+          <w:szCs w:val="22"/>
+        </w:rPr>
+        <w:t>₂₁</w:t>
+      </w:r>
+      <w:r>
+        <w:rPr>
+          <w:rFonts w:ascii="Arial" w:hAnsi="Arial" w:cs="Arial"/>
+          <w:sz w:val="22"/>
+          <w:szCs w:val="22"/>
+        </w:rPr>
+        <w:t xml:space="preserve">) and </w:t>
+      </w:r>
+      <w:r>
+        <w:rPr>
+          <w:rFonts w:ascii="Cambria Math" w:hAnsi="Cambria Math" w:cs="Cambria Math"/>
+          <w:sz w:val="22"/>
+          <w:szCs w:val="22"/>
+        </w:rPr>
+        <w:t>ℚ</w:t>
+      </w:r>
+      <w:r>
+        <w:rPr>
+          <w:rFonts w:ascii="Arial" w:hAnsi="Arial" w:cs="Arial"/>
+          <w:sz w:val="22"/>
+          <w:szCs w:val="22"/>
+        </w:rPr>
+        <w:t>(ζ</w:t>
+      </w:r>
+      <w:r>
+        <w:rPr>
+          <w:rFonts w:ascii="Cambria Math" w:hAnsi="Cambria Math" w:cs="Cambria Math"/>
+          <w:sz w:val="22"/>
+          <w:szCs w:val="22"/>
+        </w:rPr>
+        <w:t>₃₁</w:t>
+      </w:r>
+      <w:r>
+        <w:rPr>
+          <w:rFonts w:ascii="Arial" w:hAnsi="Arial" w:cs="Arial"/>
+          <w:sz w:val="22"/>
+          <w:szCs w:val="22"/>
+        </w:rPr>
+        <w:t xml:space="preserve">) are linearly disjoint over </w:t>
+      </w:r>
+      <w:r>
+        <w:rPr>
+          <w:rFonts w:ascii="Cambria Math" w:hAnsi="Cambria Math" w:cs="Cambria Math"/>
+          <w:sz w:val="22"/>
+          <w:szCs w:val="22"/>
+        </w:rPr>
+        <w:t>ℚ</w:t>
+      </w:r>
+      <w:r>
+        <w:rPr>
+          <w:rFonts w:ascii="Arial" w:hAnsi="Arial" w:cs="Arial"/>
+          <w:sz w:val="22"/>
+          <w:szCs w:val="22"/>
+        </w:rPr>
+        <w:t xml:space="preserve"> with compositum </w:t>
+      </w:r>
+      <w:r>
+        <w:rPr>
+          <w:rFonts w:ascii="Cambria Math" w:hAnsi="Cambria Math" w:cs="Cambria Math"/>
+          <w:sz w:val="22"/>
+          <w:szCs w:val="22"/>
+        </w:rPr>
+        <w:t>ℚ</w:t>
+      </w:r>
+      <w:r>
+        <w:rPr>
+          <w:rFonts w:ascii="Arial" w:hAnsi="Arial" w:cs="Arial"/>
+          <w:sz w:val="22"/>
+          <w:szCs w:val="22"/>
+        </w:rPr>
+        <w:t>(ζ</w:t>
+      </w:r>
+      <w:r>
+        <w:rPr>
+          <w:rFonts w:ascii="Cambria Math" w:hAnsi="Cambria Math" w:cs="Cambria Math"/>
+          <w:sz w:val="22"/>
+          <w:szCs w:val="22"/>
+        </w:rPr>
+        <w:t>₆₅₁</w:t>
+      </w:r>
+      <w:r>
+        <w:rPr>
+          <w:rFonts w:ascii="Arial" w:hAnsi="Arial" w:cs="Arial"/>
+          <w:sz w:val="22"/>
+          <w:szCs w:val="22"/>
+        </w:rPr>
+        <w:t xml:space="preserve">) of degree </w:t>
+      </w:r>
+      <w:proofErr w:type="gramStart"/>
+      <w:r>
+        <w:rPr>
+          <w:rFonts w:ascii="Arial" w:hAnsi="Arial" w:cs="Arial"/>
+          <w:sz w:val="22"/>
+          <w:szCs w:val="22"/>
+        </w:rPr>
+        <w:t>φ(</w:t>
+      </w:r>
+      <w:proofErr w:type="gramEnd"/>
+      <w:r>
+        <w:rPr>
+          <w:rFonts w:ascii="Arial" w:hAnsi="Arial" w:cs="Arial"/>
+          <w:sz w:val="22"/>
+          <w:szCs w:val="22"/>
+        </w:rPr>
+        <w:t>651) = φ(</w:t>
+      </w:r>
+      <w:proofErr w:type="gramStart"/>
+      <w:r>
+        <w:rPr>
+          <w:rFonts w:ascii="Arial" w:hAnsi="Arial" w:cs="Arial"/>
+          <w:sz w:val="22"/>
+          <w:szCs w:val="22"/>
+        </w:rPr>
+        <w:t>3)×</w:t>
+      </w:r>
+      <w:proofErr w:type="gramEnd"/>
+      <w:r>
+        <w:rPr>
+          <w:rFonts w:ascii="Arial" w:hAnsi="Arial" w:cs="Arial"/>
+          <w:sz w:val="22"/>
+          <w:szCs w:val="22"/>
+        </w:rPr>
+        <w:t>φ(</w:t>
+      </w:r>
+      <w:proofErr w:type="gramStart"/>
+      <w:r>
+        <w:rPr>
+          <w:rFonts w:ascii="Arial" w:hAnsi="Arial" w:cs="Arial"/>
+          <w:sz w:val="22"/>
+          <w:szCs w:val="22"/>
+        </w:rPr>
+        <w:t>7)×φ(</w:t>
+      </w:r>
+      <w:proofErr w:type="gramEnd"/>
+      <w:r>
+        <w:rPr>
+          <w:rFonts w:ascii="Arial" w:hAnsi="Arial" w:cs="Arial"/>
+          <w:sz w:val="22"/>
+          <w:szCs w:val="22"/>
+        </w:rPr>
+        <w:t>31) = 360 = h(E</w:t>
+      </w:r>
+      <w:r>
+        <w:rPr>
+          <w:rFonts w:ascii="Cambria Math" w:hAnsi="Cambria Math" w:cs="Cambria Math"/>
+          <w:sz w:val="22"/>
+          <w:szCs w:val="22"/>
+        </w:rPr>
+        <w:t>₆</w:t>
+      </w:r>
+      <w:r>
+        <w:rPr>
+          <w:rFonts w:ascii="Arial" w:hAnsi="Arial" w:cs="Arial"/>
+          <w:sz w:val="22"/>
+          <w:szCs w:val="22"/>
+        </w:rPr>
+        <w:t>) × h(E</w:t>
+      </w:r>
+      <w:r>
+        <w:rPr>
+          <w:rFonts w:ascii="Cambria Math" w:hAnsi="Cambria Math" w:cs="Cambria Math"/>
+          <w:sz w:val="22"/>
+          <w:szCs w:val="22"/>
+        </w:rPr>
+        <w:t>₈</w:t>
+      </w:r>
+      <w:r>
+        <w:rPr>
+          <w:rFonts w:ascii="Arial" w:hAnsi="Arial" w:cs="Arial"/>
+          <w:sz w:val="22"/>
+          <w:szCs w:val="22"/>
+        </w:rPr>
+        <w:t>). The three structural primes 3, 7, 31 encode as 651 = 3 × 7 × 31.</w:t>
       </w:r>
     </w:p>
     <w:p>
@@ -9982,12 +10529,6 @@
         <w:gridCol w:w="1800"/>
       </w:tblGrid>
       <w:tr>
-        <w:tblPrEx>
-          <w:tblCellMar>
-            <w:top w:w="0" w:type="dxa"/>
-            <w:bottom w:w="0" w:type="dxa"/>
-          </w:tblCellMar>
-        </w:tblPrEx>
         <w:tc>
           <w:tcPr>
             <w:tcW w:w="1500" w:type="dxa"/>
@@ -10212,12 +10753,6 @@
         </w:tc>
       </w:tr>
       <w:tr>
-        <w:tblPrEx>
-          <w:tblCellMar>
-            <w:top w:w="0" w:type="dxa"/>
-            <w:bottom w:w="0" w:type="dxa"/>
-          </w:tblCellMar>
-        </w:tblPrEx>
         <w:tc>
           <w:tcPr>
             <w:tcW w:w="1500" w:type="dxa"/>
@@ -10474,12 +11009,6 @@
         </w:tc>
       </w:tr>
       <w:tr>
-        <w:tblPrEx>
-          <w:tblCellMar>
-            <w:top w:w="0" w:type="dxa"/>
-            <w:bottom w:w="0" w:type="dxa"/>
-          </w:tblCellMar>
-        </w:tblPrEx>
         <w:tc>
           <w:tcPr>
             <w:tcW w:w="1500" w:type="dxa"/>
@@ -10736,12 +11265,6 @@
         </w:tc>
       </w:tr>
       <w:tr>
-        <w:tblPrEx>
-          <w:tblCellMar>
-            <w:top w:w="0" w:type="dxa"/>
-            <w:bottom w:w="0" w:type="dxa"/>
-          </w:tblCellMar>
-        </w:tblPrEx>
         <w:tc>
           <w:tcPr>
             <w:tcW w:w="1500" w:type="dxa"/>
@@ -11476,6 +11999,7 @@
           <w:sz w:val="28"/>
           <w:szCs w:val="28"/>
         </w:rPr>
+        <w:lastRenderedPageBreak/>
         <w:t xml:space="preserve">8. The (2,3,7) Triangle Group and the </w:t>
       </w:r>
       <w:proofErr w:type="spellStart"/>
@@ -11680,7 +12204,6 @@
           <w:sz w:val="22"/>
           <w:szCs w:val="22"/>
         </w:rPr>
-        <w:lastRenderedPageBreak/>
         <w:t>The key numerical relation is lcm(</w:t>
       </w:r>
       <w:proofErr w:type="gramStart"/>
@@ -12882,6 +13405,7 @@
           <w:sz w:val="22"/>
           <w:szCs w:val="22"/>
         </w:rPr>
+        <w:lastRenderedPageBreak/>
         <w:t xml:space="preserve">Step 4 (b = 5, not 7). </w:t>
       </w:r>
       <w:r>
@@ -12975,6 +13499,232 @@
           <w:szCs w:val="22"/>
         </w:rPr>
         <w:t xml:space="preserve"> diagram), while {7, 8, 11} give their conjugates. This selects e = 5 over e = 7.</w:t>
+      </w:r>
+    </w:p>
+    <w:p>
+      <w:pPr>
+        <w:spacing w:after="200"/>
+        <w:rPr>
+          <w:rFonts w:ascii="Arial" w:hAnsi="Arial" w:cs="Arial"/>
+          <w:sz w:val="22"/>
+          <w:szCs w:val="22"/>
+        </w:rPr>
+      </w:pPr>
+      <w:r>
+        <w:rPr>
+          <w:rFonts w:ascii="Arial" w:hAnsi="Arial" w:cs="Arial"/>
+          <w:b/>
+          <w:bCs/>
+          <w:i/>
+          <w:iCs/>
+          <w:sz w:val="22"/>
+          <w:szCs w:val="22"/>
+        </w:rPr>
+        <w:t>Theorem (Route B Forcing).</w:t>
+      </w:r>
+      <w:r>
+        <w:rPr>
+          <w:rFonts w:ascii="Arial" w:hAnsi="Arial" w:cs="Arial"/>
+          <w:sz w:val="22"/>
+          <w:szCs w:val="22"/>
+        </w:rPr>
+        <w:t xml:space="preserve"> α</w:t>
+      </w:r>
+      <w:r>
+        <w:rPr>
+          <w:rFonts w:ascii="Cambria Math" w:hAnsi="Cambria Math" w:cs="Cambria Math"/>
+          <w:sz w:val="22"/>
+          <w:szCs w:val="22"/>
+        </w:rPr>
+        <w:t>⁻</w:t>
+      </w:r>
+      <w:r>
+        <w:rPr>
+          <w:rFonts w:ascii="Arial" w:hAnsi="Arial" w:cs="Arial"/>
+          <w:sz w:val="22"/>
+          <w:szCs w:val="22"/>
+        </w:rPr>
+        <w:t>¹ = N(h(E</w:t>
+      </w:r>
+      <w:r>
+        <w:rPr>
+          <w:rFonts w:ascii="Cambria Math" w:hAnsi="Cambria Math" w:cs="Cambria Math"/>
+          <w:sz w:val="22"/>
+          <w:szCs w:val="22"/>
+        </w:rPr>
+        <w:t>₆</w:t>
+      </w:r>
+      <w:r>
+        <w:rPr>
+          <w:rFonts w:ascii="Arial" w:hAnsi="Arial" w:cs="Arial"/>
+          <w:sz w:val="22"/>
+          <w:szCs w:val="22"/>
+        </w:rPr>
+        <w:t>) + e</w:t>
+      </w:r>
+      <w:r>
+        <w:rPr>
+          <w:rFonts w:ascii="Cambria Math" w:hAnsi="Cambria Math" w:cs="Cambria Math"/>
+          <w:sz w:val="22"/>
+          <w:szCs w:val="22"/>
+        </w:rPr>
+        <w:t>₃</w:t>
+      </w:r>
+      <w:r>
+        <w:rPr>
+          <w:rFonts w:ascii="Arial" w:hAnsi="Arial" w:cs="Arial"/>
+          <w:sz w:val="22"/>
+          <w:szCs w:val="22"/>
+        </w:rPr>
+        <w:t>·ω) + dim(D</w:t>
+      </w:r>
+      <w:r>
+        <w:rPr>
+          <w:rFonts w:ascii="Cambria Math" w:hAnsi="Cambria Math" w:cs="Cambria Math"/>
+          <w:sz w:val="22"/>
+          <w:szCs w:val="22"/>
+        </w:rPr>
+        <w:t>₄</w:t>
+      </w:r>
+      <w:r>
+        <w:rPr>
+          <w:rFonts w:ascii="Arial" w:hAnsi="Arial" w:cs="Arial"/>
+          <w:sz w:val="22"/>
+          <w:szCs w:val="22"/>
+        </w:rPr>
+        <w:t xml:space="preserve">) = </w:t>
+      </w:r>
+      <w:proofErr w:type="gramStart"/>
+      <w:r>
+        <w:rPr>
+          <w:rFonts w:ascii="Arial" w:hAnsi="Arial" w:cs="Arial"/>
+          <w:sz w:val="22"/>
+          <w:szCs w:val="22"/>
+        </w:rPr>
+        <w:t>N(</w:t>
+      </w:r>
+      <w:proofErr w:type="gramEnd"/>
+      <w:r>
+        <w:rPr>
+          <w:rFonts w:ascii="Arial" w:hAnsi="Arial" w:cs="Arial"/>
+          <w:sz w:val="22"/>
+          <w:szCs w:val="22"/>
+        </w:rPr>
+        <w:t>12 + 5ω) + 28 = 109 + 28 = 137, with zero free parameters. The constants h(E</w:t>
+      </w:r>
+      <w:r>
+        <w:rPr>
+          <w:rFonts w:ascii="Cambria Math" w:hAnsi="Cambria Math" w:cs="Cambria Math"/>
+          <w:sz w:val="22"/>
+          <w:szCs w:val="22"/>
+        </w:rPr>
+        <w:t>₆</w:t>
+      </w:r>
+      <w:r>
+        <w:rPr>
+          <w:rFonts w:ascii="Arial" w:hAnsi="Arial" w:cs="Arial"/>
+          <w:sz w:val="22"/>
+          <w:szCs w:val="22"/>
+        </w:rPr>
+        <w:t>) = 12, e</w:t>
+      </w:r>
+      <w:r>
+        <w:rPr>
+          <w:rFonts w:ascii="Cambria Math" w:hAnsi="Cambria Math" w:cs="Cambria Math"/>
+          <w:sz w:val="22"/>
+          <w:szCs w:val="22"/>
+        </w:rPr>
+        <w:t>₃</w:t>
+      </w:r>
+      <w:r>
+        <w:rPr>
+          <w:rFonts w:ascii="Arial" w:hAnsi="Arial" w:cs="Arial"/>
+          <w:sz w:val="22"/>
+          <w:szCs w:val="22"/>
+        </w:rPr>
+        <w:t xml:space="preserve"> = 5, and dim(D</w:t>
+      </w:r>
+      <w:r>
+        <w:rPr>
+          <w:rFonts w:ascii="Cambria Math" w:hAnsi="Cambria Math" w:cs="Cambria Math"/>
+          <w:sz w:val="22"/>
+          <w:szCs w:val="22"/>
+        </w:rPr>
+        <w:t>₄</w:t>
+      </w:r>
+      <w:r>
+        <w:rPr>
+          <w:rFonts w:ascii="Arial" w:hAnsi="Arial" w:cs="Arial"/>
+          <w:sz w:val="22"/>
+          <w:szCs w:val="22"/>
+        </w:rPr>
+        <w:t>) = 28 are uniquely determined by E</w:t>
+      </w:r>
+      <w:r>
+        <w:rPr>
+          <w:rFonts w:ascii="Cambria Math" w:hAnsi="Cambria Math" w:cs="Cambria Math"/>
+          <w:sz w:val="22"/>
+          <w:szCs w:val="22"/>
+        </w:rPr>
+        <w:t>₆</w:t>
+      </w:r>
+      <w:r>
+        <w:rPr>
+          <w:rFonts w:ascii="Arial" w:hAnsi="Arial" w:cs="Arial"/>
+          <w:sz w:val="22"/>
+          <w:szCs w:val="22"/>
+        </w:rPr>
+        <w:t xml:space="preserve"> Lie-algebraic invariants: h by the McKay correspondence, e</w:t>
+      </w:r>
+      <w:r>
+        <w:rPr>
+          <w:rFonts w:ascii="Cambria Math" w:hAnsi="Cambria Math" w:cs="Cambria Math"/>
+          <w:sz w:val="22"/>
+          <w:szCs w:val="22"/>
+        </w:rPr>
+        <w:t>₃</w:t>
+      </w:r>
+      <w:r>
+        <w:rPr>
+          <w:rFonts w:ascii="Arial" w:hAnsi="Arial" w:cs="Arial"/>
+          <w:sz w:val="22"/>
+          <w:szCs w:val="22"/>
+        </w:rPr>
+        <w:t xml:space="preserve"> by the positive Weyl chamber orientation of the </w:t>
+      </w:r>
+      <w:proofErr w:type="spellStart"/>
+      <w:r>
+        <w:rPr>
+          <w:rFonts w:ascii="Arial" w:hAnsi="Arial" w:cs="Arial"/>
+          <w:sz w:val="22"/>
+          <w:szCs w:val="22"/>
+        </w:rPr>
+        <w:t>Dynkin</w:t>
+      </w:r>
+      <w:proofErr w:type="spellEnd"/>
+      <w:r>
+        <w:rPr>
+          <w:rFonts w:ascii="Arial" w:hAnsi="Arial" w:cs="Arial"/>
+          <w:sz w:val="22"/>
+          <w:szCs w:val="22"/>
+        </w:rPr>
+        <w:t xml:space="preserve"> diagram, and dim(D</w:t>
+      </w:r>
+      <w:r>
+        <w:rPr>
+          <w:rFonts w:ascii="Cambria Math" w:hAnsi="Cambria Math" w:cs="Cambria Math"/>
+          <w:sz w:val="22"/>
+          <w:szCs w:val="22"/>
+        </w:rPr>
+        <w:t>₄</w:t>
+      </w:r>
+      <w:r>
+        <w:rPr>
+          <w:rFonts w:ascii="Arial" w:hAnsi="Arial" w:cs="Arial"/>
+          <w:sz w:val="22"/>
+          <w:szCs w:val="22"/>
+        </w:rPr>
+        <w:t>) by the three-channel triality structure. Exhaustive search confirms (12, 5) is the unique solution.</w:t>
       </w:r>
     </w:p>
     <w:p>
@@ -13166,7 +13916,6 @@
           <w:sz w:val="22"/>
           <w:szCs w:val="22"/>
         </w:rPr>
-        <w:lastRenderedPageBreak/>
         <w:drawing>
           <wp:inline distT="0" distB="0" distL="0" distR="0" wp14:anchorId="5770183B" wp14:editId="5770183C">
             <wp:extent cx="5486400" cy="4114800"/>
@@ -13628,7 +14377,6 @@
           <w:sz w:val="22"/>
           <w:szCs w:val="22"/>
         </w:rPr>
-        <w:lastRenderedPageBreak/>
         <w:t xml:space="preserve">However, the cyclotomic structure (Section 7.2) reveals that the split has arithmetic content: the ternary sector lives in </w:t>
       </w:r>
       <w:r>
@@ -13917,15 +14665,7 @@
           <w:sz w:val="22"/>
           <w:szCs w:val="22"/>
         </w:rPr>
-        <w:t>𝔽</w:t>
-      </w:r>
-      <w:r>
-        <w:rPr>
-          <w:rFonts w:ascii="Cambria Math" w:hAnsi="Cambria Math" w:cs="Cambria Math"/>
-          <w:sz w:val="22"/>
-          <w:szCs w:val="22"/>
-        </w:rPr>
-        <w:t>₂</w:t>
+        <w:t>𝔽₂</w:t>
       </w:r>
       <w:r>
         <w:rPr>
@@ -13957,15 +14697,7 @@
           <w:sz w:val="22"/>
           <w:szCs w:val="22"/>
         </w:rPr>
-        <w:t>𝔽</w:t>
-      </w:r>
-      <w:r>
-        <w:rPr>
-          <w:rFonts w:ascii="Cambria Math" w:hAnsi="Cambria Math" w:cs="Cambria Math"/>
-          <w:sz w:val="22"/>
-          <w:szCs w:val="22"/>
-        </w:rPr>
-        <w:t>₂</w:t>
+        <w:t>𝔽₂</w:t>
       </w:r>
       <w:r>
         <w:rPr>
@@ -14493,6 +15225,7 @@
           <w:sz w:val="22"/>
           <w:szCs w:val="22"/>
         </w:rPr>
+        <w:lastRenderedPageBreak/>
         <w:t xml:space="preserve">(v) </w:t>
       </w:r>
       <w:r>
@@ -14809,7 +15542,6 @@
           <w:sz w:val="22"/>
           <w:szCs w:val="22"/>
         </w:rPr>
-        <w:lastRenderedPageBreak/>
         <w:t xml:space="preserve">The identification with </w:t>
       </w:r>
       <w:proofErr w:type="gramStart"/>
@@ -15430,6 +16162,7 @@
           <w:sz w:val="22"/>
           <w:szCs w:val="22"/>
         </w:rPr>
+        <w:lastRenderedPageBreak/>
         <w:drawing>
           <wp:inline distT="0" distB="0" distL="0" distR="0" wp14:anchorId="5770183D" wp14:editId="5770183E">
             <wp:extent cx="4572000" cy="3429000"/>
@@ -15551,7 +16284,6 @@
           <w:sz w:val="22"/>
           <w:szCs w:val="22"/>
         </w:rPr>
-        <w:lastRenderedPageBreak/>
         <w:drawing>
           <wp:inline distT="0" distB="0" distL="0" distR="0" wp14:anchorId="5770183F" wp14:editId="57701840">
             <wp:extent cx="4572000" cy="3429000"/>
@@ -15695,6 +16427,7 @@
           <w:sz w:val="22"/>
           <w:szCs w:val="22"/>
         </w:rPr>
+        <w:lastRenderedPageBreak/>
         <w:drawing>
           <wp:inline distT="0" distB="0" distL="0" distR="0" wp14:anchorId="57701841" wp14:editId="57701842">
             <wp:extent cx="5029200" cy="3771900"/>
@@ -15887,6 +16620,11 @@
     </w:p>
     <w:p>
       <w:pPr>
+        <w:pStyle w:val="ListParagraph"/>
+        <w:numPr>
+          <w:ilvl w:val="0"/>
+          <w:numId w:val="2"/>
+        </w:numPr>
         <w:spacing w:after="200"/>
         <w:rPr>
           <w:rFonts w:ascii="Arial" w:hAnsi="Arial" w:cs="Arial"/>
@@ -15902,7 +16640,7 @@
           <w:sz w:val="22"/>
           <w:szCs w:val="22"/>
         </w:rPr>
-        <w:t xml:space="preserve">1. The canonical identification of 56 vertices (RESOLVED). </w:t>
+        <w:t xml:space="preserve">The canonical identification of 56 vertices (RESOLVED). </w:t>
       </w:r>
       <w:r>
         <w:rPr>
@@ -16036,15 +16774,7 @@
           <w:sz w:val="22"/>
           <w:szCs w:val="22"/>
         </w:rPr>
-        <w:t>𝔽</w:t>
-      </w:r>
-      <w:r>
-        <w:rPr>
-          <w:rFonts w:ascii="Cambria Math" w:hAnsi="Cambria Math" w:cs="Cambria Math"/>
-          <w:sz w:val="22"/>
-          <w:szCs w:val="22"/>
-        </w:rPr>
-        <w:t>₂</w:t>
+        <w:t>𝔽₂</w:t>
       </w:r>
       <w:r>
         <w:rPr>
@@ -16195,6 +16925,11 @@
     </w:p>
     <w:p>
       <w:pPr>
+        <w:pStyle w:val="ListParagraph"/>
+        <w:numPr>
+          <w:ilvl w:val="0"/>
+          <w:numId w:val="2"/>
+        </w:numPr>
         <w:spacing w:after="200"/>
         <w:rPr>
           <w:rFonts w:ascii="Arial" w:hAnsi="Arial" w:cs="Arial"/>
@@ -16210,7 +16945,7 @@
           <w:sz w:val="22"/>
           <w:szCs w:val="22"/>
         </w:rPr>
-        <w:t>2. The E</w:t>
+        <w:t>The E</w:t>
       </w:r>
       <w:r>
         <w:rPr>
@@ -16367,6 +17102,11 @@
     </w:p>
     <w:p>
       <w:pPr>
+        <w:pStyle w:val="ListParagraph"/>
+        <w:numPr>
+          <w:ilvl w:val="0"/>
+          <w:numId w:val="2"/>
+        </w:numPr>
         <w:spacing w:after="200"/>
         <w:rPr>
           <w:rFonts w:ascii="Arial" w:hAnsi="Arial" w:cs="Arial"/>
@@ -16382,7 +17122,7 @@
           <w:sz w:val="22"/>
           <w:szCs w:val="22"/>
         </w:rPr>
-        <w:t xml:space="preserve">3. The (2,3,7) triangle group as </w:t>
+        <w:t xml:space="preserve">The (2,3,7) triangle group as </w:t>
       </w:r>
       <w:proofErr w:type="spellStart"/>
       <w:r>
@@ -16511,6 +17251,11 @@
     </w:p>
     <w:p>
       <w:pPr>
+        <w:pStyle w:val="ListParagraph"/>
+        <w:numPr>
+          <w:ilvl w:val="0"/>
+          <w:numId w:val="2"/>
+        </w:numPr>
         <w:spacing w:after="200"/>
         <w:rPr>
           <w:rFonts w:ascii="Arial" w:hAnsi="Arial" w:cs="Arial"/>
@@ -16526,7 +17271,7 @@
           <w:sz w:val="22"/>
           <w:szCs w:val="22"/>
         </w:rPr>
-        <w:t>4. The 36 even theta characteristics and E</w:t>
+        <w:t>The 36 even theta characteristics and E</w:t>
       </w:r>
       <w:r>
         <w:rPr>
@@ -17150,7 +17895,15 @@
           <w:sz w:val="22"/>
           <w:szCs w:val="22"/>
         </w:rPr>
-        <w:t xml:space="preserve">28, 12, 6, 4). The identification is exact — verified by spectrum, triangle count, 4-clique count, clique decomposition (8 maximum cliques of size 7), and edge-by-edge isomorphism (0 mismatches out of 378). This closes the chain: Klein quartic → 28 bitangents → </w:t>
+        <w:t xml:space="preserve">28, 12, 6, 4). </w:t>
+      </w:r>
+      <w:r>
+        <w:rPr>
+          <w:rFonts w:ascii="Arial" w:hAnsi="Arial" w:cs="Arial"/>
+          <w:sz w:val="22"/>
+          <w:szCs w:val="22"/>
+        </w:rPr>
+        <w:t xml:space="preserve">The identification is exact </w:t>
       </w:r>
       <w:proofErr w:type="gramStart"/>
       <w:r>
@@ -17159,7 +17912,15 @@
           <w:sz w:val="22"/>
           <w:szCs w:val="22"/>
         </w:rPr>
-        <w:t>T(</w:t>
+        <w:t xml:space="preserve">— </w:t>
+      </w:r>
+      <w:r>
+        <w:rPr>
+          <w:rFonts w:ascii="Arial" w:hAnsi="Arial" w:cs="Arial"/>
+          <w:sz w:val="22"/>
+          <w:szCs w:val="22"/>
+        </w:rPr>
+        <w:t xml:space="preserve"> verified</w:t>
       </w:r>
       <w:proofErr w:type="gramEnd"/>
       <w:r>
@@ -17168,39 +17929,7 @@
           <w:sz w:val="22"/>
           <w:szCs w:val="22"/>
         </w:rPr>
-        <w:t>8) → D</w:t>
-      </w:r>
-      <w:r>
-        <w:rPr>
-          <w:rFonts w:ascii="Cambria Math" w:hAnsi="Cambria Math" w:cs="Cambria Math"/>
-          <w:sz w:val="22"/>
-          <w:szCs w:val="22"/>
-        </w:rPr>
-        <w:t>₄</w:t>
-      </w:r>
-      <w:r>
-        <w:rPr>
-          <w:rFonts w:ascii="Arial" w:hAnsi="Arial" w:cs="Arial"/>
-          <w:sz w:val="22"/>
-          <w:szCs w:val="22"/>
-        </w:rPr>
-        <w:t xml:space="preserve"> triality → Route B → α</w:t>
-      </w:r>
-      <w:r>
-        <w:rPr>
-          <w:rFonts w:ascii="Cambria Math" w:hAnsi="Cambria Math" w:cs="Cambria Math"/>
-          <w:sz w:val="22"/>
-          <w:szCs w:val="22"/>
-        </w:rPr>
-        <w:t>⁻</w:t>
-      </w:r>
-      <w:r>
-        <w:rPr>
-          <w:rFonts w:ascii="Arial" w:hAnsi="Arial" w:cs="Arial"/>
-          <w:sz w:val="22"/>
-          <w:szCs w:val="22"/>
-        </w:rPr>
-        <w:t>¹ = 137.</w:t>
+        <w:t xml:space="preserve"> by spectrum, triangle count, 4-clique count, clique decomposition (8 maximum cliques of size 7), and edge-by-edge isomorphism (0 mismatches out of 378) [Computation AZ-1].</w:t>
       </w:r>
     </w:p>
     <w:p>
@@ -18920,6 +19649,14 @@
         </w:rPr>
         <w:t>, 10.5281/zenodo.18980026</w:t>
       </w:r>
+      <w:r>
+        <w:rPr>
+          <w:rFonts w:ascii="Arial" w:hAnsi="Arial" w:cs="Arial"/>
+          <w:sz w:val="22"/>
+          <w:szCs w:val="22"/>
+        </w:rPr>
+        <w:t xml:space="preserve"> (March 2026)</w:t>
+      </w:r>
     </w:p>
     <w:p>
       <w:pPr>
@@ -18984,6 +19721,14 @@
         </w:rPr>
         <w:t>, 10.5281/zenodo.18981288</w:t>
       </w:r>
+      <w:r>
+        <w:rPr>
+          <w:rFonts w:ascii="Arial" w:hAnsi="Arial" w:cs="Arial"/>
+          <w:sz w:val="22"/>
+          <w:szCs w:val="22"/>
+        </w:rPr>
+        <w:t xml:space="preserve"> (March 2026)</w:t>
+      </w:r>
     </w:p>
     <w:p>
       <w:pPr>
@@ -19068,6 +19813,14 @@
         </w:rPr>
         <w:t>, 10.5281/zenodo.18984592</w:t>
       </w:r>
+      <w:r>
+        <w:rPr>
+          <w:rFonts w:ascii="Arial" w:hAnsi="Arial" w:cs="Arial"/>
+          <w:sz w:val="22"/>
+          <w:szCs w:val="22"/>
+        </w:rPr>
+        <w:t xml:space="preserve"> (March 2026)</w:t>
+      </w:r>
     </w:p>
     <w:p>
       <w:pPr>
@@ -19158,15 +19911,42 @@
           <w:sz w:val="22"/>
           <w:szCs w:val="22"/>
         </w:rPr>
-        <w:t>The Riemann Zeros as Collapse Events of the Binary Architecture.</w:t>
-      </w:r>
-      <w:r>
-        <w:rPr>
-          <w:rFonts w:ascii="Arial" w:hAnsi="Arial" w:cs="Arial"/>
-          <w:sz w:val="22"/>
-          <w:szCs w:val="22"/>
-        </w:rPr>
-        <w:t xml:space="preserve"> Submitted March 2026.</w:t>
+        <w:t>The Riemann Zeros as Collapse Events of the Binary Architecture</w:t>
+      </w:r>
+      <w:r>
+        <w:rPr>
+          <w:rFonts w:ascii="Arial" w:hAnsi="Arial" w:cs="Arial"/>
+          <w:i/>
+          <w:iCs/>
+          <w:sz w:val="22"/>
+          <w:szCs w:val="22"/>
+        </w:rPr>
+        <w:t xml:space="preserve">, </w:t>
+      </w:r>
+      <w:hyperlink r:id="rId13" w:history="1">
+        <w:r>
+          <w:rPr>
+            <w:rStyle w:val="Hyperlink"/>
+            <w:rFonts w:ascii="Arial" w:hAnsi="Arial" w:cs="Arial"/>
+            <w:i/>
+            <w:iCs/>
+            <w:color w:val="auto"/>
+            <w:sz w:val="22"/>
+            <w:szCs w:val="22"/>
+            <w:u w:val="none"/>
+          </w:rPr>
+          <w:t>https://doi.org/10.5281/zenodo.19053965</w:t>
+        </w:r>
+      </w:hyperlink>
+      <w:r>
+        <w:rPr>
+          <w:rFonts w:ascii="Arial" w:hAnsi="Arial" w:cs="Arial"/>
+          <w:i/>
+          <w:iCs/>
+          <w:sz w:val="22"/>
+          <w:szCs w:val="22"/>
+        </w:rPr>
+        <w:t xml:space="preserve"> (March 2026). </w:t>
       </w:r>
     </w:p>
     <w:p>
@@ -19671,6 +20451,7 @@
           <w:rFonts w:ascii="Arial" w:hAnsi="Arial" w:cs="Arial"/>
           <w:sz w:val="22"/>
           <w:szCs w:val="22"/>
+          <w:lang w:val="nb-NO"/>
         </w:rPr>
       </w:pPr>
       <w:r>
@@ -19715,7 +20496,16 @@
           <w:sz w:val="22"/>
           <w:szCs w:val="22"/>
         </w:rPr>
-        <w:t>), Johns Hopkins Univ. Press (2004), 279–311.</w:t>
+        <w:t xml:space="preserve">), Johns Hopkins Univ. </w:t>
+      </w:r>
+      <w:r>
+        <w:rPr>
+          <w:rFonts w:ascii="Arial" w:hAnsi="Arial" w:cs="Arial"/>
+          <w:sz w:val="22"/>
+          <w:szCs w:val="22"/>
+          <w:lang w:val="nb-NO"/>
+        </w:rPr>
+        <w:t>Press (2004), 279–311.</w:t>
       </w:r>
     </w:p>
     <w:p>
@@ -20828,15 +21618,7 @@
           <w:sz w:val="22"/>
           <w:szCs w:val="22"/>
         </w:rPr>
-        <w:t>𝔽</w:t>
-      </w:r>
-      <w:r>
-        <w:rPr>
-          <w:rFonts w:ascii="Cambria Math" w:hAnsi="Cambria Math" w:cs="Cambria Math"/>
-          <w:sz w:val="22"/>
-          <w:szCs w:val="22"/>
-        </w:rPr>
-        <w:t>₂</w:t>
+        <w:t>𝔽₂</w:t>
       </w:r>
       <w:r>
         <w:rPr>
@@ -20848,8 +21630,8 @@
       </w:r>
     </w:p>
     <w:sectPr>
-      <w:headerReference w:type="default" r:id="rId13"/>
-      <w:footerReference w:type="default" r:id="rId14"/>
+      <w:headerReference w:type="default" r:id="rId14"/>
+      <w:footerReference w:type="default" r:id="rId15"/>
       <w:pgSz w:w="12240" w:h="15840"/>
       <w:pgMar w:top="1440" w:right="1440" w:bottom="1440" w:left="1440" w:header="708" w:footer="708" w:gutter="0"/>
       <w:cols w:space="720"/>
@@ -21048,11 +21830,100 @@
       </w:pPr>
     </w:lvl>
   </w:abstractNum>
+  <w:abstractNum w:abstractNumId="1" w15:restartNumberingAfterBreak="0">
+    <w:nsid w:val="18B51DCD"/>
+    <w:multiLevelType w:val="hybridMultilevel"/>
+    <w:tmpl w:val="E4D8BCBC"/>
+    <w:lvl w:ilvl="0" w:tplc="0409000F">
+      <w:start w:val="1"/>
+      <w:numFmt w:val="decimal"/>
+      <w:lvlText w:val="%1."/>
+      <w:lvlJc w:val="left"/>
+      <w:pPr>
+        <w:ind w:left="720" w:hanging="360"/>
+      </w:pPr>
+    </w:lvl>
+    <w:lvl w:ilvl="1" w:tplc="04090019" w:tentative="1">
+      <w:start w:val="1"/>
+      <w:numFmt w:val="lowerLetter"/>
+      <w:lvlText w:val="%2."/>
+      <w:lvlJc w:val="left"/>
+      <w:pPr>
+        <w:ind w:left="1440" w:hanging="360"/>
+      </w:pPr>
+    </w:lvl>
+    <w:lvl w:ilvl="2" w:tplc="0409001B" w:tentative="1">
+      <w:start w:val="1"/>
+      <w:numFmt w:val="lowerRoman"/>
+      <w:lvlText w:val="%3."/>
+      <w:lvlJc w:val="right"/>
+      <w:pPr>
+        <w:ind w:left="2160" w:hanging="180"/>
+      </w:pPr>
+    </w:lvl>
+    <w:lvl w:ilvl="3" w:tplc="0409000F" w:tentative="1">
+      <w:start w:val="1"/>
+      <w:numFmt w:val="decimal"/>
+      <w:lvlText w:val="%4."/>
+      <w:lvlJc w:val="left"/>
+      <w:pPr>
+        <w:ind w:left="2880" w:hanging="360"/>
+      </w:pPr>
+    </w:lvl>
+    <w:lvl w:ilvl="4" w:tplc="04090019" w:tentative="1">
+      <w:start w:val="1"/>
+      <w:numFmt w:val="lowerLetter"/>
+      <w:lvlText w:val="%5."/>
+      <w:lvlJc w:val="left"/>
+      <w:pPr>
+        <w:ind w:left="3600" w:hanging="360"/>
+      </w:pPr>
+    </w:lvl>
+    <w:lvl w:ilvl="5" w:tplc="0409001B" w:tentative="1">
+      <w:start w:val="1"/>
+      <w:numFmt w:val="lowerRoman"/>
+      <w:lvlText w:val="%6."/>
+      <w:lvlJc w:val="right"/>
+      <w:pPr>
+        <w:ind w:left="4320" w:hanging="180"/>
+      </w:pPr>
+    </w:lvl>
+    <w:lvl w:ilvl="6" w:tplc="0409000F" w:tentative="1">
+      <w:start w:val="1"/>
+      <w:numFmt w:val="decimal"/>
+      <w:lvlText w:val="%7."/>
+      <w:lvlJc w:val="left"/>
+      <w:pPr>
+        <w:ind w:left="5040" w:hanging="360"/>
+      </w:pPr>
+    </w:lvl>
+    <w:lvl w:ilvl="7" w:tplc="04090019" w:tentative="1">
+      <w:start w:val="1"/>
+      <w:numFmt w:val="lowerLetter"/>
+      <w:lvlText w:val="%8."/>
+      <w:lvlJc w:val="left"/>
+      <w:pPr>
+        <w:ind w:left="5760" w:hanging="360"/>
+      </w:pPr>
+    </w:lvl>
+    <w:lvl w:ilvl="8" w:tplc="0409001B" w:tentative="1">
+      <w:start w:val="1"/>
+      <w:numFmt w:val="lowerRoman"/>
+      <w:lvlText w:val="%9."/>
+      <w:lvlJc w:val="right"/>
+      <w:pPr>
+        <w:ind w:left="6480" w:hanging="180"/>
+      </w:pPr>
+    </w:lvl>
+  </w:abstractNum>
   <w:num w:numId="1" w16cid:durableId="1086802494">
     <w:abstractNumId w:val="0"/>
     <w:lvlOverride w:ilvl="0">
       <w:startOverride w:val="1"/>
     </w:lvlOverride>
+  </w:num>
+  <w:num w:numId="2" w16cid:durableId="561216180">
+    <w:abstractNumId w:val="1"/>
   </w:num>
 </w:numbering>
 </file>
@@ -21701,6 +22572,18 @@
     <w:uiPriority w:val="99"/>
     <w:rsid w:val="00C86118"/>
   </w:style>
+  <w:style w:type="character" w:styleId="UnresolvedMention">
+    <w:name w:val="Unresolved Mention"/>
+    <w:basedOn w:val="DefaultParagraphFont"/>
+    <w:uiPriority w:val="99"/>
+    <w:semiHidden/>
+    <w:unhideWhenUsed/>
+    <w:rsid w:val="00B37FCE"/>
+    <w:rPr>
+      <w:color w:val="605E5C"/>
+      <w:shd w:val="clear" w:color="auto" w:fill="E1DFDD"/>
+    </w:rPr>
+  </w:style>
 </w:styles>
 </file>
 

</xml_diff>